<commit_message>
Release v1.6 audience sizing and independent dual scrollers
</commit_message>
<xml_diff>
--- a/Documentation/Hazz_Karaoke_Hoster_Complete_Manual.docx
+++ b/Documentation/Hazz_Karaoke_Hoster_Complete_Manual.docx
@@ -7,7 +7,7 @@
         <w:pStyle w:val="Title"/>
       </w:pPr>
       <w:r>
-        <w:t>Hazz Karaoke Hoster v1.5 User Manual</w:t>
+        <w:t>Hazz Karaoke Hoster v1.6 User Manual</w:t>
       </w:r>
     </w:p>
     <w:p>
@@ -28,7 +28,7 @@
               <a:graphicData uri="http://schemas.openxmlformats.org/drawingml/2006/picture">
                 <pic:pic>
                   <pic:nvPicPr>
-                    <pic:cNvPr id="0" name="console_v1.5.png"/>
+                    <pic:cNvPr id="0" name="console_v1.6.png"/>
                     <pic:cNvPicPr/>
                   </pic:nvPicPr>
                   <pic:blipFill>
@@ -57,10 +57,278 @@
       </w:r>
     </w:p>
     <w:p>
+      <w:r>
+        <w:br w:type="page"/>
+      </w:r>
+    </w:p>
+    <w:p>
       <w:pPr>
         <w:pStyle w:val="Heading1"/>
       </w:pPr>
       <w:r>
+        <w:t>Audience display controls</w:t>
+      </w:r>
+    </w:p>
+    <w:p>
+      <w:r>
+        <w:drawing>
+          <wp:inline xmlns:a="http://schemas.openxmlformats.org/drawingml/2006/main" xmlns:pic="http://schemas.openxmlformats.org/drawingml/2006/picture">
+            <wp:extent cx="5486400" cy="6150864"/>
+            <wp:docPr id="2" name="Picture 2"/>
+            <wp:cNvGraphicFramePr>
+              <a:graphicFrameLocks noChangeAspect="1"/>
+            </wp:cNvGraphicFramePr>
+            <a:graphic>
+              <a:graphicData uri="http://schemas.openxmlformats.org/drawingml/2006/picture">
+                <pic:pic>
+                  <pic:nvPicPr>
+                    <pic:cNvPr id="0" name="audience-settings-v1.6.png"/>
+                    <pic:cNvPicPr/>
+                  </pic:nvPicPr>
+                  <pic:blipFill>
+                    <a:blip r:embed="rId10"/>
+                    <a:stretch>
+                      <a:fillRect/>
+                    </a:stretch>
+                  </pic:blipFill>
+                  <pic:spPr>
+                    <a:xfrm>
+                      <a:off x="0" y="0"/>
+                      <a:ext cx="5486400" cy="6150864"/>
+                    </a:xfrm>
+                    <a:prstGeom prst="rect"/>
+                  </pic:spPr>
+                </pic:pic>
+              </a:graphicData>
+            </a:graphic>
+          </wp:inline>
+        </w:drawing>
+      </w:r>
+    </w:p>
+    <w:p>
+      <w:r>
+        <w:t>The v1.6 settings panel with a sample second message. Choose your own text, fonts, sizes and colours.</w:t>
+      </w:r>
+    </w:p>
+    <w:p>
+      <w:r>
+        <w:br w:type="page"/>
+      </w:r>
+    </w:p>
+    <w:p>
+      <w:pPr>
+        <w:pStyle w:val="Heading1"/>
+      </w:pPr>
+      <w:r>
+        <w:t>Hazz Karaoke Hoster v1.6 audience display guide</w:t>
+      </w:r>
+    </w:p>
+    <w:p>
+      <w:r>
+        <w:t>Version 1.6 adds Fit or Stretch for karaoke playback, separate rotation and message switches, and a second independent scrolling message. The existing Fit display and combined primary scroller remain the defaults. The second scroller starts switched off.</w:t>
+      </w:r>
+    </w:p>
+    <w:p>
+      <w:pPr>
+        <w:pStyle w:val="Heading2"/>
+      </w:pPr>
+      <w:r>
+        <w:t>Fill the audience screen with karaoke</w:t>
+      </w:r>
+    </w:p>
+    <w:p>
+      <w:r>
+        <w:t>1. Open DISPLAY, then Audience Settings — Backgrounds, Logo, Scroller.</w:t>
+      </w:r>
+    </w:p>
+    <w:p>
+      <w:r>
+        <w:t>2. Find Karaoke playback sizing beside the scroller switches.</w:t>
+      </w:r>
+    </w:p>
+    <w:p>
+      <w:r>
+        <w:t>3. Choose Fit to show the entire picture in its original proportions. A square or 4:3 song on a widescreen TV will have side borders.</w:t>
+      </w:r>
+    </w:p>
+    <w:p>
+      <w:r>
+        <w:t>4. Choose Stretch to fill the audience display. This changes the picture proportions, so faces and lettering may look wider or taller.</w:t>
+      </w:r>
+    </w:p>
+    <w:p>
+      <w:r>
+        <w:t>5. Play a CD+G or karaoke video and check the TV. The setting applies to both Windows and VLC karaoke video engines, including Windows fallback. It can also be changed during playback.</w:t>
+      </w:r>
+    </w:p>
+    <w:p>
+      <w:r>
+        <w:t>This setting affects the audience karaoke picture, not the private host preview, ordinary music videos or idle artwork. The existing Screen fit control under Singer-view background still controls images, GIFs and background videos. Black borders recorded inside a video remain part of that video; Stretch cannot remove them independently. Crisp or smooth CD+G remains available.</w:t>
+      </w:r>
+    </w:p>
+    <w:p>
+      <w:pPr>
+        <w:pStyle w:val="Heading2"/>
+      </w:pPr>
+      <w:r>
+        <w:t>Show a message without revealing the singer order</w:t>
+      </w:r>
+    </w:p>
+    <w:p>
+      <w:r>
+        <w:t>1. Open DISPLAY &gt; Audience Settings.</w:t>
+      </w:r>
+    </w:p>
+    <w:p>
+      <w:r>
+        <w:t>2. Leave Primary scroller switched on.</w:t>
+      </w:r>
+    </w:p>
+    <w:p>
+      <w:r>
+        <w:t>3. Switch off Show singer rotation.</w:t>
+      </w:r>
+    </w:p>
+    <w:p>
+      <w:r>
+        <w:t>4. Leave Show custom message switched on and type your announcement into the message box beside Primary scroller.</w:t>
+      </w:r>
+    </w:p>
+    <w:p>
+      <w:r>
+        <w:t>5. If you also want to hide the separate upcoming-singers panel, switch off Show next 4 singers at the top of this panel.</w:t>
+      </w:r>
+    </w:p>
+    <w:p>
+      <w:r>
+        <w:t>Only the announcement now scrolls. You can rearrange the singers privately. To show the order again, enable Show singer rotation. Both content switches can be on together; rotation comes first and the message follows. Turning Primary scroller off hides the entire first bar. Turning both content switches off also hides it. An empty message adds no text. When rotation is enabled but there are no singers, the bar says Singer rotation empty.</w:t>
+      </w:r>
+    </w:p>
+    <w:p>
+      <w:pPr>
+        <w:pStyle w:val="Heading2"/>
+      </w:pPr>
+      <w:r>
+        <w:t>Add a second scrolling message</w:t>
+      </w:r>
+    </w:p>
+    <w:p>
+      <w:r>
+        <w:t>1. Switch on Second message scroller.</w:t>
+      </w:r>
+    </w:p>
+    <w:p>
+      <w:r>
+        <w:t>2. Enter the second message in its box, for example DRINKS OFFERS — ASK AT THE BAR. A blank message keeps this bar hidden.</w:t>
+      </w:r>
+    </w:p>
+    <w:p>
+      <w:r>
+        <w:t>3. Choose Second font. Drag its Size slider to choose 16–120 pixels; the number beside it shows the selected size.</w:t>
+      </w:r>
+    </w:p>
+    <w:p>
+      <w:r>
+        <w:t>4. Drag the second Speed slider to choose how fast that message moves. This does not change the primary scroller speed.</w:t>
+      </w:r>
+    </w:p>
+    <w:p>
+      <w:r>
+        <w:t>5. Press SECOND COLOUR to choose this message's colour.</w:t>
+      </w:r>
+    </w:p>
+    <w:p>
+      <w:r>
+        <w:t>6. Use the second Move away from edge slider if the TV cuts off the edge of the message.</w:t>
+      </w:r>
+    </w:p>
+    <w:p>
+      <w:r>
+        <w:t>The second message works even when Primary scroller is off. Each bar has its own font, size, speed and inset. Primary rotation and message colours still use the ROTATION and VENUE MSG buttons. Existing primary text outline settings continue to apply.</w:t>
+      </w:r>
+    </w:p>
+    <w:p>
+      <w:pPr>
+        <w:pStyle w:val="Heading2"/>
+      </w:pPr>
+      <w:r>
+        <w:t>Keep the two bars apart</w:t>
+      </w:r>
+    </w:p>
+    <w:p>
+      <w:r>
+        <w:t>1. Use Position in the primary scroller controls to choose Top or Bottom.</w:t>
+      </w:r>
+    </w:p>
+    <w:p>
+      <w:r>
+        <w:t>2. The second bar automatically uses the opposite edge. Primary Bottom means second Top; primary Top means second Bottom. This also determines the second bar's edge when the primary is off.</w:t>
+      </w:r>
+    </w:p>
+    <w:p>
+      <w:r>
+        <w:t>3. Try the edge-inset sliders while looking at the audience TV. A larger number moves that bar inward.</w:t>
+      </w:r>
+    </w:p>
+    <w:p>
+      <w:r>
+        <w:t>Hazz limits the effective inset so each bar stays in its own half of the audience screen. The requested slider value is retained, but may be reduced on a short display or with large fonts to keep the bars apart. Extremely short windows can clip large text; enlarge the audience window or reduce its font size. The upcoming-singers panel keeps clearance from visible bars.</w:t>
+      </w:r>
+    </w:p>
+    <w:p>
+      <w:pPr>
+        <w:pStyle w:val="Heading2"/>
+      </w:pPr>
+      <w:r>
+        <w:t>What happens during songs and when saving</w:t>
+      </w:r>
+    </w:p>
+    <w:p>
+      <w:r>
+        <w:t>Both scrollers and the upcoming-singers panel hide during karaoke playback and the Kamikaze announcement, as the original scroller did. They return afterwards. To show enabled scrollers over ordinary music videos, tick Both scrollers under SHOW DURING MUSIC VIDEOS. Leave it off for an unobstructed music video. Permanent logo behaviour is unchanged.</w:t>
+      </w:r>
+    </w:p>
+    <w:p>
+      <w:r>
+        <w:t>Settings apply live. Press CLOSE to dismiss the panel. Close Hazz normally to retain your display choices; do not end it using Task Manager. When using venue profiles, save or update that profile to keep these choices with the venue, following the existing venue save rules. An older profile without the new fields uses Fit, enables both primary content switches, and leaves the second bar off. Existing singers, favourites and playlists are not changed by these options.</w:t>
+      </w:r>
+    </w:p>
+    <w:p>
+      <w:pPr>
+        <w:pStyle w:val="Heading2"/>
+      </w:pPr>
+      <w:r>
+        <w:t>Update or build v1.6</w:t>
+      </w:r>
+    </w:p>
+    <w:p>
+      <w:r>
+        <w:t>Download the normal Windows ZIP and extract the entire folder, or choose the optional Single EXE ZIP. Close the old Hazz before launching the new copy. Both use your existing Hazz data location. Keep all runtime folders with the normal download. The single EXE extracts its bundled runtime automatically. No separate VLC installation is needed.</w:t>
+      </w:r>
+    </w:p>
+    <w:p>
+      <w:r>
+        <w:t>To build yourself, install Visual Studio 2026 with .NET desktop development and .NET 10, open HazzKaraokeHoster.sln, select Release / x64 and build. The normal app is in RELEASE/HazzKaraokeHoster and the optional single executable is in RELEASE/SingleFile.</w:t>
+      </w:r>
+    </w:p>
+    <w:p>
+      <w:r>
+        <w:t>Copyright © 2026 Hazz Karaoke. All rights reserved in the original Hazz Karaoke Hoster code, documentation, branding and artwork. Third-party components remain subject to their respective licences.</w:t>
+      </w:r>
+    </w:p>
+    <w:p>
+      <w:pPr>
+        <w:pStyle w:val="Heading2"/>
+      </w:pPr>
+      <w:r>
+        <w:t>Retained features and instructions</w:t>
+      </w:r>
+    </w:p>
+    <w:p>
+      <w:pPr>
+        <w:pStyle w:val="Heading1"/>
+      </w:pPr>
+      <w:r>
         <w:t>Hazz Karaoke Hoster v1.5</w:t>
       </w:r>
     </w:p>
@@ -1381,7 +1649,7 @@
     </w:p>
     <w:p>
       <w:r>
-        <w:t>While a music video is shown, Hazz hides the next-singer list, full rotation scroller, venue message, background media and persistent logo. The audience sees only the fitted video, with no singer information covering it. The configured overlays return automatically when the music video ends.</w:t>
+        <w:t>By default, music videos hide the singer lists, scrollers, background media and logo. In Audience Settings, SHOW DURING MUSIC VIDEOS lets you keep the logo, both enabled scrollers, next singers or Kamikaze message visible. Background media stays hidden. The usual audience display returns when the video ends.</w:t>
       </w:r>
     </w:p>
     <w:p>
@@ -1441,7 +1709,7 @@
     </w:p>
     <w:p>
       <w:r>
-        <w:t>Enable the full rotation scroller, enter an optional venue message, and choose font, size, speed, colour and top or bottom placement.</w:t>
+        <w:t>Enable Primary scroller, then choose Show singer rotation, Show custom message, or both. Choose its font, size, speed, colour, position and inset. Enable Second message scroller for an independent message at the opposite edge; use its separate styling controls. See the v1.6 instructions at the start of this guide.</w:t>
       </w:r>
     </w:p>
     <w:p>
@@ -2217,7 +2485,7 @@
     </w:p>
     <w:p>
       <w:r>
-        <w:t>- Rotation / venue scroller</w:t>
+        <w:t>- Both scrollers</w:t>
       </w:r>
     </w:p>
     <w:p>

</xml_diff>

<commit_message>
Release v1.7 AV sync, full audience preview and CDG transparency
</commit_message>
<xml_diff>
--- a/Documentation/Hazz_Karaoke_Hoster_Complete_Manual.docx
+++ b/Documentation/Hazz_Karaoke_Hoster_Complete_Manual.docx
@@ -7,7 +7,12 @@
         <w:pStyle w:val="Title"/>
       </w:pPr>
       <w:r>
-        <w:t>Hazz Karaoke Hoster v1.6 User Manual</w:t>
+        <w:t>Hazz Karaoke Hoster v1.7 User Manual</w:t>
+      </w:r>
+    </w:p>
+    <w:p>
+      <w:r>
+        <w:t>Made For KJ/DJ's By A KJ/DJ</w:t>
       </w:r>
     </w:p>
     <w:p>
@@ -28,7 +33,7 @@
               <a:graphicData uri="http://schemas.openxmlformats.org/drawingml/2006/picture">
                 <pic:pic>
                   <pic:nvPicPr>
-                    <pic:cNvPr id="0" name="console_v1.6.png"/>
+                    <pic:cNvPr id="0" name="console_v1.7.png"/>
                     <pic:cNvPicPr/>
                   </pic:nvPicPr>
                   <pic:blipFill>
@@ -73,7 +78,7 @@
       <w:r>
         <w:drawing>
           <wp:inline xmlns:a="http://schemas.openxmlformats.org/drawingml/2006/main" xmlns:pic="http://schemas.openxmlformats.org/drawingml/2006/picture">
-            <wp:extent cx="5486400" cy="6150864"/>
+            <wp:extent cx="5780228" cy="7315200"/>
             <wp:docPr id="2" name="Picture 2"/>
             <wp:cNvGraphicFramePr>
               <a:graphicFrameLocks noChangeAspect="1"/>
@@ -82,7 +87,7 @@
               <a:graphicData uri="http://schemas.openxmlformats.org/drawingml/2006/picture">
                 <pic:pic>
                   <pic:nvPicPr>
-                    <pic:cNvPr id="0" name="audience-settings-v1.6.png"/>
+                    <pic:cNvPr id="0" name="audience-settings-v1.7.png"/>
                     <pic:cNvPicPr/>
                   </pic:nvPicPr>
                   <pic:blipFill>
@@ -94,7 +99,7 @@
                   <pic:spPr>
                     <a:xfrm>
                       <a:off x="0" y="0"/>
-                      <a:ext cx="5486400" cy="6150864"/>
+                      <a:ext cx="5780228" cy="7315200"/>
                     </a:xfrm>
                     <a:prstGeom prst="rect"/>
                   </pic:spPr>
@@ -107,7 +112,7 @@
     </w:p>
     <w:p>
       <w:r>
-        <w:t>The v1.6 settings panel with a sample second message. Choose your own text, fonts, sizes and colours.</w:t>
+        <w:t>The v1.7 settings panel with a sample second message. Choose your own text, fonts, sizes and colours.</w:t>
       </w:r>
     </w:p>
     <w:p>
@@ -120,6 +125,296 @@
         <w:pStyle w:val="Heading1"/>
       </w:pPr>
       <w:r>
+        <w:t>Complete audience preview</w:t>
+      </w:r>
+    </w:p>
+    <w:p>
+      <w:r>
+        <w:drawing>
+          <wp:inline xmlns:a="http://schemas.openxmlformats.org/drawingml/2006/main" xmlns:pic="http://schemas.openxmlformats.org/drawingml/2006/picture">
+            <wp:extent cx="5486400" cy="3429000"/>
+            <wp:docPr id="3" name="Picture 3"/>
+            <wp:cNvGraphicFramePr>
+              <a:graphicFrameLocks noChangeAspect="1"/>
+            </wp:cNvGraphicFramePr>
+            <a:graphic>
+              <a:graphicData uri="http://schemas.openxmlformats.org/drawingml/2006/picture">
+                <pic:pic>
+                  <pic:nvPicPr>
+                    <pic:cNvPr id="0" name="audience-preview-v1.7.png"/>
+                    <pic:cNvPicPr/>
+                  </pic:nvPicPr>
+                  <pic:blipFill>
+                    <a:blip r:embed="rId11"/>
+                    <a:stretch>
+                      <a:fillRect/>
+                    </a:stretch>
+                  </pic:blipFill>
+                  <pic:spPr>
+                    <a:xfrm>
+                      <a:off x="0" y="0"/>
+                      <a:ext cx="5486400" cy="3429000"/>
+                    </a:xfrm>
+                    <a:prstGeom prst="rect"/>
+                  </pic:spPr>
+                </pic:pic>
+              </a:graphicData>
+            </a:graphic>
+          </wp:inline>
+        </w:drawing>
+      </w:r>
+    </w:p>
+    <w:p>
+      <w:r>
+        <w:t>Actual preview rendering with sample singers, messages and a coloured test image in the photo position.</w:t>
+      </w:r>
+    </w:p>
+    <w:p>
+      <w:r>
+        <w:br w:type="page"/>
+      </w:r>
+    </w:p>
+    <w:p>
+      <w:pPr>
+        <w:pStyle w:val="Heading1"/>
+      </w:pPr>
+      <w:r>
+        <w:t>Hazz Karaoke Hoster v1.7 display and sync guide</w:t>
+      </w:r>
+    </w:p>
+    <w:p>
+      <w:r>
+        <w:t>Made For KJ/DJ's By A KJ/DJ</w:t>
+      </w:r>
+    </w:p>
+    <w:p>
+      <w:r>
+        <w:t>Version 1.7 adds video AV Sync, a complete audience preview and optional transparent CD+G backgrounds. Existing playback, singer history, venue profiles, two scrollers and Fit/Stretch controls remain available. Transparency starts off.</w:t>
+      </w:r>
+    </w:p>
+    <w:p>
+      <w:pPr>
+        <w:pStyle w:val="Heading2"/>
+      </w:pPr>
+      <w:r>
+        <w:t>Correct karaoke video timing with AV Sync</w:t>
+      </w:r>
+    </w:p>
+    <w:p>
+      <w:r>
+        <w:t>1. Load and play a karaoke video. Listen to the sound and watch the audience picture or preview.</w:t>
+      </w:r>
+    </w:p>
+    <w:p>
+      <w:r>
+        <w:t>2. Find CDG / VIDEO AV SYNC on the karaoke deck.</w:t>
+      </w:r>
+    </w:p>
+    <w:p>
+      <w:r>
+        <w:t>3. Press +0.25s when the picture or displayed lyrics are late. A positive value moves the picture ahead of the audio. For example, at audio time 10 seconds, +1 second shows video time 11 seconds.</w:t>
+      </w:r>
+    </w:p>
+    <w:p>
+      <w:r>
+        <w:t>4. Press −0.25s when the picture is early. A negative value delays the picture. At audio time 10 seconds, −1 second shows video time 9 seconds.</w:t>
+      </w:r>
+    </w:p>
+    <w:p>
+      <w:r>
+        <w:t>5. Use small steps until it looks right. The available range is −10 to +10 seconds. Sound continues normally; the control adjusts the picture.</w:t>
+      </w:r>
+    </w:p>
+    <w:p>
+      <w:r>
+        <w:t>6. Press SAVE to keep that track default. Press RESET for zero; press SAVE afterwards if you want zero to replace the saved default.</w:t>
+      </w:r>
+    </w:p>
+    <w:p>
+      <w:r>
+        <w:t>The same controls still adjust CD+G graphics. Video AV Sync works with Windows and VLC audience video, including pause, resume, seeking and the preview. Negative offsets hold the opening picture until audio reaches the required point; positions cannot run before the start or beyond the end of a video. This corrects a consistent offset, not a badly edited recording whose timing varies throughout the song. It does not adjust ordinary music-deck videos.</w:t>
+      </w:r>
+    </w:p>
+    <w:p>
+      <w:r>
+        <w:t>The track default is used when loading the file directly and is also saved to its library record when available. Existing queued singer/song sync preferences remain independent and take precedence when loading that singer's request. Adjust those in the singer's song/history window or while that singer's song is loaded. File-based defaults are matched by the original path, including the original ZIP path for zipped karaoke; moving or renaming a file changes that match. Saving does not rewrite the media file.</w:t>
+      </w:r>
+    </w:p>
+    <w:p>
+      <w:pPr>
+        <w:pStyle w:val="Heading2"/>
+      </w:pPr>
+      <w:r>
+        <w:t>Preview the whole audience screen</w:t>
+      </w:r>
+    </w:p>
+    <w:p>
+      <w:r>
+        <w:t>1. Press SHOW PREVIEW above the singers list if the preview is hidden.</w:t>
+      </w:r>
+    </w:p>
+    <w:p>
+      <w:r>
+        <w:t>2. The panel now shows AUDIENCE PREVIEW. Between songs it includes your background, singer names and photos, logo, both enabled scrollers and any Kamikaze announcement.</w:t>
+      </w:r>
+    </w:p>
+    <w:p>
+      <w:r>
+        <w:t>3. Open DISPLAY &gt; Audience Settings and change your messages or layout. The preview follows the actual audience scene, including the same scroller positions and slideshow item.</w:t>
+      </w:r>
+    </w:p>
+    <w:p>
+      <w:r>
+        <w:t>4. Start karaoke or a music video. The preview follows playback and the audience overlay visibility rules. During karaoke, singer lists and scrollers remain hidden as configured by Hazz's normal karaoke display behaviour.</w:t>
+      </w:r>
+    </w:p>
+    <w:p>
+      <w:r>
+        <w:t>5. Press HIDE PREVIEW to recover space and release its extra video decoder. Showing it again reconnects to the current scene.</w:t>
+      </w:r>
+    </w:p>
+    <w:p>
+      <w:r>
+        <w:t>The preview works without opening a TV window, using a 16:9 preparation scene until an audience window supplies its size. When the audience window is open, the preview fits its proportions. It never sends an audience window to another display by itself. Normal TV and display-selection buttons still control where the audience sees the show.</w:t>
+      </w:r>
+    </w:p>
+    <w:p>
+      <w:r>
+        <w:t>The preview's video decoder is muted, so it cannot add a second copy of the audio. Native video is mirrored using a separate muted decoder and can differ by a few frames; this is a monitoring preview, not a frame-accurate recording. Backgrounds, photos and text use the shared audience scene. A powerful video may need more resources with preview enabled, so hide the preview if your laptop is struggling.</w:t>
+      </w:r>
+    </w:p>
+    <w:p>
+      <w:pPr>
+        <w:pStyle w:val="Heading2"/>
+      </w:pPr>
+      <w:r>
+        <w:t>Put your own background behind CD+G lyrics</w:t>
+      </w:r>
+    </w:p>
+    <w:p>
+      <w:r>
+        <w:t>1. Open DISPLAY &gt; Audience Settings.</w:t>
+      </w:r>
+    </w:p>
+    <w:p>
+      <w:r>
+        <w:t>2. Enable Singer-view background. Choose an image, GIF or video, or choose a folder for the existing one-minute slideshow.</w:t>
+      </w:r>
+    </w:p>
+    <w:p>
+      <w:r>
+        <w:t>3. Enable Transparent CD+G background.</w:t>
+      </w:r>
+    </w:p>
+    <w:p>
+      <w:r>
+        <w:t>4. Leave Remove colour on Auto first. Hazz removes the colour identified by the CD+G memory-preset background instructions.</w:t>
+      </w:r>
+    </w:p>
+    <w:p>
+      <w:r>
+        <w:t>5. Play the CD+G song and check AUDIENCE PREVIEW. The chosen background now continues behind the remaining graphics during karaoke.</w:t>
+      </w:r>
+    </w:p>
+    <w:p>
+      <w:r>
+        <w:t>6. If Auto removes the wrong area, try Palette 0 through Palette 15 in Remove colour. These are the song's sixteen colour slots, not fixed names such as black or white. Choose the slot that removes the background while keeping the words readable.</w:t>
+      </w:r>
+    </w:p>
+    <w:p>
+      <w:r>
+        <w:t>7. Adjust Background opacity to dim your artwork towards black. Adjust Lyrics opacity separately; 100% keeps the remaining CD+G graphics fully visible.</w:t>
+      </w:r>
+    </w:p>
+    <w:p>
+      <w:r>
+        <w:t>8. Use the existing background Screen fit and GIF speed controls as needed. Karaoke Fit/Stretch still controls the CD+G picture itself.</w:t>
+      </w:r>
+    </w:p>
+    <w:p>
+      <w:r>
+        <w:t>CD+G is a coloured pixel image, not a separate lyrics layer. Any artwork or lyric pixels using the selected colour can also disappear. Lyrics opacity affects all remaining CD+G graphics, including title cards and drawings. Check each song and keep the background calm enough for the words to stay readable. This feature does not remove backgrounds from MP4 or other ordinary karaoke videos.</w:t>
+      </w:r>
+    </w:p>
+    <w:p>
+      <w:pPr>
+        <w:pStyle w:val="Heading2"/>
+      </w:pPr>
+      <w:r>
+        <w:t>Keep a CD+G adjustment for one song</w:t>
+      </w:r>
+    </w:p>
+    <w:p>
+      <w:r>
+        <w:t>1. Load the CD+G song and adjust transparency, colour slot and both opacity sliders.</w:t>
+      </w:r>
+    </w:p>
+    <w:p>
+      <w:r>
+        <w:t>2. Press SAVE FOR THIS SONG. Hazz stores that combination against the original song path. It works for a CDG/audio pair or a karaoke ZIP, without modifying either file.</w:t>
+      </w:r>
+    </w:p>
+    <w:p>
+      <w:r>
+        <w:t>3. Load the song again to recall the saved combination. The controls show the recalled settings.</w:t>
+      </w:r>
+    </w:p>
+    <w:p>
+      <w:r>
+        <w:t>4. Press USE DEFAULTS to remove that song's override and return to the general CD+G display defaults.</w:t>
+      </w:r>
+    </w:p>
+    <w:p>
+      <w:r>
+        <w:t>5. Press RESTORE ORIGINAL for an immediate opaque, full-opacity CD+G picture. If the song already has a saved override, press SAVE FOR THIS SONG afterwards to keep the restored appearance for future loads.</w:t>
+      </w:r>
+    </w:p>
+    <w:p>
+      <w:r>
+        <w:t>When no song override is active, changing these controls changes the general default. When an override is active, changes are temporary until SAVE FOR THIS SONG is pressed. Close Hazz normally to keep general settings. Venue profiles save the display settings under the existing venue save rules; an older profile without these options uses transparency off. Read the status line after saving: if storage is unavailable, Hazz leaves the show running and asks you to retry.</w:t>
+      </w:r>
+    </w:p>
+    <w:p>
+      <w:pPr>
+        <w:pStyle w:val="Heading2"/>
+      </w:pPr>
+      <w:r>
+        <w:t>Downloads and testing</w:t>
+      </w:r>
+    </w:p>
+    <w:p>
+      <w:r>
+        <w:t>The normal Windows folder ZIP and optional Single EXE ZIP contain the same features. Close your old Hazz, extract the new download and launch it. Keep every runtime folder with the normal ZIP. Both versions use your existing Hazz data location. The single EXE extracts its bundled runtime automatically. No separate VLC installation is required.</w:t>
+      </w:r>
+    </w:p>
+    <w:p>
+      <w:r>
+        <w:t>For Visual Studio 2026, install the .NET desktop development workload and .NET 10, open HazzKaraokeHoster.sln and build Release / x64. The normal package is produced in RELEASE/HazzKaraokeHoster, and the optional executable in RELEASE/SingleFile.</w:t>
+      </w:r>
+    </w:p>
+    <w:p>
+      <w:r>
+        <w:t>Validation covers compilation, CD+G alpha/keying and seek reset, saved-setting preservation, preview-only composition, four-skin layouts, Windows/VLC AV Sync, pause, seek, preview muting and fallback. Please rehearse on your own laptop, audience display and sound devices before using the update at a live show; a multi-hour hardware show test is not part of these automated checks.</w:t>
+      </w:r>
+    </w:p>
+    <w:p>
+      <w:r>
+        <w:t>Copyright © 2026 Hazz Karaoke. All rights reserved in the original Hazz Karaoke Hoster code, documentation, branding and artwork. Third-party components remain subject to their respective licences.</w:t>
+      </w:r>
+    </w:p>
+    <w:p>
+      <w:pPr>
+        <w:pStyle w:val="Heading2"/>
+      </w:pPr>
+      <w:r>
+        <w:t>Retained features and instructions</w:t>
+      </w:r>
+    </w:p>
+    <w:p>
+      <w:pPr>
+        <w:pStyle w:val="Heading1"/>
+      </w:pPr>
+      <w:r>
         <w:t>Hazz Karaoke Hoster v1.6 audience display guide</w:t>
       </w:r>
     </w:p>
@@ -163,7 +458,7 @@
     </w:p>
     <w:p>
       <w:r>
-        <w:t>This setting affects the audience karaoke picture, not the private host preview, ordinary music videos or idle artwork. The existing Screen fit control under Singer-view background still controls images, GIFs and background videos. Black borders recorded inside a video remain part of that video; Stretch cannot remove them independently. Crisp or smooth CD+G remains available.</w:t>
+        <w:t>This setting affects the audience karaoke picture, not ordinary music videos or idle artwork; the audience preview now mirrors this sizing. The existing Screen fit control under Singer-view background still controls images, GIFs and background videos. Black borders recorded inside a video remain part of that video; Stretch cannot remove them independently. Crisp or smooth CD+G remains available.</w:t>
       </w:r>
     </w:p>
     <w:p>

</xml_diff>

<commit_message>
Keep audience settings readable on smaller laptop displays
</commit_message>
<xml_diff>
--- a/Documentation/Hazz_Karaoke_Hoster_Complete_Manual.docx
+++ b/Documentation/Hazz_Karaoke_Hoster_Complete_Manual.docx
@@ -78,7 +78,7 @@
       <w:r>
         <w:drawing>
           <wp:inline xmlns:a="http://schemas.openxmlformats.org/drawingml/2006/main" xmlns:pic="http://schemas.openxmlformats.org/drawingml/2006/picture">
-            <wp:extent cx="5780228" cy="7315200"/>
+            <wp:extent cx="5486400" cy="3048000"/>
             <wp:docPr id="2" name="Picture 2"/>
             <wp:cNvGraphicFramePr>
               <a:graphicFrameLocks noChangeAspect="1"/>
@@ -99,7 +99,7 @@
                   <pic:spPr>
                     <a:xfrm>
                       <a:off x="0" y="0"/>
-                      <a:ext cx="5780228" cy="7315200"/>
+                      <a:ext cx="5486400" cy="3048000"/>
                     </a:xfrm>
                     <a:prstGeom prst="rect"/>
                   </pic:spPr>
@@ -112,7 +112,7 @@
     </w:p>
     <w:p>
       <w:r>
-        <w:t>The v1.7 settings panel with a sample second message. Choose your own text, fonts, sizes and colours.</w:t>
+        <w:t>The v1.7 scrollable settings panel at laptop size. Scroll down for background, transparency and other controls; CLOSE remains visible.</w:t>
       </w:r>
     </w:p>
     <w:p>
@@ -185,6 +185,11 @@
     <w:p>
       <w:r>
         <w:t>Made For KJ/DJ's By A KJ/DJ</w:t>
+      </w:r>
+    </w:p>
+    <w:p>
+      <w:r>
+        <w:t>Audience settings on smaller screens: open DISPLAY &gt; Audience Settings. Controls keep your chosen GUI text size instead of shrinking to fit the whole panel. Use the mouse wheel or the vertical scrollbar to reach the lower settings. CLOSE stays visible at the bottom. At 1366×768 you do not need to reduce Windows scaling to use this panel.</w:t>
       </w:r>
     </w:p>
     <w:p>

</xml_diff>